<commit_message>
Finalize delivery packaging cleanup
</commit_message>
<xml_diff>
--- a/docs/documents/01-需求规格说明书.docx
+++ b/docs/documents/01-需求规格说明书.docx
@@ -504,7 +504,7 @@
           <w:b w:val="0"/>
           <w:sz w:val="24"/>
         </w:rPr>
-        <w:t>（2）支持用户按会议室和时间发起单次预约或每周重复预约，并在冲突时提供替代方案。</w:t>
+        <w:t>（2）当前页面主流程支持用户按会议室和时间发起单次预约，并在冲突时提供替代方案；后端保留每周周期预约接口能力。</w:t>
       </w:r>
     </w:p>
     <w:p>
@@ -1531,7 +1531,7 @@
                 <w:b w:val="0"/>
                 <w:sz w:val="21"/>
               </w:rPr>
-              <w:t>登录、查看个人看板、查看会议室日历、创建预约、创建周期预约、查看/取消/删除本人预约、接收通知。</w:t>
+              <w:t>登录、查看个人看板、查看会议室日历、创建单次预约、查看/取消/删除本人预约、接收通知。</w:t>
             </w:r>
           </w:p>
         </w:tc>
@@ -2179,7 +2179,7 @@
                 <w:b w:val="0"/>
                 <w:sz w:val="21"/>
               </w:rPr>
-              <w:t>支持单次预约和每周重复预约，并按审批规则生成待审批或已批准状态。</w:t>
+              <w:t>当前页面主流程支持单次预约，并按审批规则生成待审批或已批准状态；每周周期预约保留为后端接口能力。</w:t>
             </w:r>
           </w:p>
         </w:tc>
@@ -3217,29 +3217,29 @@
                 <w:b w:val="0"/>
                 <w:sz w:val="21"/>
               </w:rPr>
-              <w:t>周期预约</w:t>
-            </w:r>
-          </w:p>
-        </w:tc>
-        <w:tc>
-          <w:tcPr>
-            <w:tcW w:type="dxa" w:w="3009"/>
-            <w:vAlign w:val="center"/>
-          </w:tcPr>
-          <w:p>
-            <w:pPr>
-              <w:spacing w:line="240" w:lineRule="auto" w:before="0" w:after="0"/>
-              <w:ind w:firstLine="0"/>
-              <w:jc w:val="center"/>
-            </w:pPr>
-            <w:r/>
-            <w:r>
-              <w:rPr>
-                <w:rFonts w:ascii="宋体" w:hAnsi="宋体" w:eastAsia="宋体"/>
-                <w:b w:val="0"/>
-                <w:sz w:val="21"/>
-              </w:rPr>
-              <w:t>每周周期预约仅允许 1-12 周。</w:t>
+              <w:t>周期预约（接口预留）</w:t>
+            </w:r>
+          </w:p>
+        </w:tc>
+        <w:tc>
+          <w:tcPr>
+            <w:tcW w:type="dxa" w:w="3009"/>
+            <w:vAlign w:val="center"/>
+          </w:tcPr>
+          <w:p>
+            <w:pPr>
+              <w:spacing w:line="240" w:lineRule="auto" w:before="0" w:after="0"/>
+              <w:ind w:firstLine="0"/>
+              <w:jc w:val="center"/>
+            </w:pPr>
+            <w:r/>
+            <w:r>
+              <w:rPr>
+                <w:rFonts w:ascii="宋体" w:hAnsi="宋体" w:eastAsia="宋体"/>
+                <w:b w:val="0"/>
+                <w:sz w:val="21"/>
+              </w:rPr>
+              <w:t>后端保留每周周期预约接口，当前页面演示主流程不包含该入口；接口层周期次数仅允许 1-12 周。</w:t>
             </w:r>
           </w:p>
         </w:tc>

</xml_diff>